<commit_message>
Bai 2: bo sung diagram
</commit_message>
<xml_diff>
--- a/Tuan02/Bai2 Component-Based Thinking.docx
+++ b/Tuan02/Bai2 Component-Based Thinking.docx
@@ -1308,21 +1308,11 @@
       <w:r>
         <w:rPr>
           <w:rFonts w:ascii="Times New Roman" w:hAnsi="Times New Roman" w:cs="Times New Roman"/>
-          <w:b/>
-          <w:bCs/>
           <w:sz w:val="26"/>
           <w:szCs w:val="26"/>
         </w:rPr>
         <w:lastRenderedPageBreak/>
-        <w:t>Lưu ý thực tế:</w:t>
-      </w:r>
-      <w:r>
-        <w:rPr>
-          <w:rFonts w:ascii="Times New Roman" w:hAnsi="Times New Roman" w:cs="Times New Roman"/>
-          <w:sz w:val="26"/>
-          <w:szCs w:val="26"/>
-        </w:rPr>
-        <w:t xml:space="preserve"> Trong khi code cụ thể (ví dụ dùng Spring Boot), bên trong mỗi Domain Module (ví dụ package com.app.course), ta vẫn có thể chia nhỏ thành các technical layers nhỏ (Controller, Service, Repository) </w:t>
+        <w:t xml:space="preserve">Trong khi code cụ thể (ví dụ dùng Spring Boot), bên trong mỗi Domain Module (ví dụ package com.app.course), ta vẫn có thể chia nhỏ thành các technical layers nhỏ (Controller, Service, Repository) </w:t>
       </w:r>
       <w:r>
         <w:rPr>
@@ -1360,6 +1350,428 @@
         </w:rPr>
         <w:t>.</w:t>
       </w:r>
+    </w:p>
+    <w:p>
+      <w:pPr>
+        <w:rPr>
+          <w:rFonts w:ascii="Times New Roman" w:hAnsi="Times New Roman" w:cs="Times New Roman"/>
+          <w:sz w:val="26"/>
+          <w:szCs w:val="26"/>
+        </w:rPr>
+      </w:pPr>
+      <w:r>
+        <w:rPr>
+          <w:rFonts w:ascii="Times New Roman" w:hAnsi="Times New Roman" w:cs="Times New Roman"/>
+          <w:sz w:val="26"/>
+          <w:szCs w:val="26"/>
+        </w:rPr>
+        <w:t>Module diagram cho 2 hướng</w:t>
+      </w:r>
+      <w:r>
+        <w:rPr>
+          <w:rFonts w:ascii="Times New Roman" w:hAnsi="Times New Roman" w:cs="Times New Roman"/>
+          <w:sz w:val="26"/>
+          <w:szCs w:val="26"/>
+        </w:rPr>
+        <w:t xml:space="preserve"> :</w:t>
+      </w:r>
+    </w:p>
+    <w:p>
+      <w:pPr>
+        <w:rPr>
+          <w:rFonts w:ascii="Times New Roman" w:hAnsi="Times New Roman" w:cs="Times New Roman"/>
+          <w:b/>
+          <w:bCs/>
+          <w:sz w:val="26"/>
+          <w:szCs w:val="26"/>
+        </w:rPr>
+      </w:pPr>
+      <w:r>
+        <w:rPr>
+          <w:rFonts w:ascii="Times New Roman" w:hAnsi="Times New Roman" w:cs="Times New Roman"/>
+          <w:b/>
+          <w:bCs/>
+          <w:sz w:val="26"/>
+          <w:szCs w:val="26"/>
+        </w:rPr>
+        <w:t>Domain Decomposition (Phân rã theo nghiệp vụ)</w:t>
+      </w:r>
+    </w:p>
+    <w:p>
+      <w:pPr>
+        <w:rPr>
+          <w:rFonts w:ascii="Times New Roman" w:hAnsi="Times New Roman" w:cs="Times New Roman"/>
+          <w:sz w:val="26"/>
+          <w:szCs w:val="26"/>
+        </w:rPr>
+      </w:pPr>
+      <w:r>
+        <w:rPr>
+          <w:rFonts w:ascii="Times New Roman" w:hAnsi="Times New Roman" w:cs="Times New Roman"/>
+          <w:b/>
+          <w:bCs/>
+          <w:sz w:val="26"/>
+          <w:szCs w:val="26"/>
+        </w:rPr>
+        <w:t>Đặc điểm hình ảnh:</w:t>
+      </w:r>
+      <w:r>
+        <w:rPr>
+          <w:rFonts w:ascii="Times New Roman" w:hAnsi="Times New Roman" w:cs="Times New Roman"/>
+          <w:sz w:val="26"/>
+          <w:szCs w:val="26"/>
+        </w:rPr>
+        <w:t xml:space="preserve"> Các module đứng độc lập, xếp hàng ngang (hoặc khối), mỗi module là một "thế giới riêng". Nhìn vào là thấy ngay tính năng của phần mềm.</w:t>
+      </w:r>
+    </w:p>
+    <w:p>
+      <w:pPr>
+        <w:rPr>
+          <w:rFonts w:ascii="Times New Roman" w:hAnsi="Times New Roman" w:cs="Times New Roman"/>
+          <w:sz w:val="26"/>
+          <w:szCs w:val="26"/>
+        </w:rPr>
+      </w:pPr>
+      <w:r>
+        <w:rPr>
+          <w:rFonts w:ascii="Times New Roman" w:hAnsi="Times New Roman" w:cs="Times New Roman"/>
+          <w:sz w:val="26"/>
+          <w:szCs w:val="26"/>
+        </w:rPr>
+        <w:drawing>
+          <wp:anchor distT="0" distB="0" distL="114300" distR="114300" simplePos="0" relativeHeight="251658240" behindDoc="0" locked="0" layoutInCell="1" allowOverlap="1" wp14:anchorId="6365A5E1" wp14:editId="3F119A09">
+            <wp:simplePos x="0" y="0"/>
+            <wp:positionH relativeFrom="column">
+              <wp:posOffset>0</wp:posOffset>
+            </wp:positionH>
+            <wp:positionV relativeFrom="paragraph">
+              <wp:posOffset>-1905</wp:posOffset>
+            </wp:positionV>
+            <wp:extent cx="3208020" cy="5256530"/>
+            <wp:effectExtent l="0" t="0" r="0" b="1270"/>
+            <wp:wrapSquare wrapText="bothSides"/>
+            <wp:docPr id="276128215" name="Picture 2"/>
+            <wp:cNvGraphicFramePr>
+              <a:graphicFrameLocks xmlns:a="http://schemas.openxmlformats.org/drawingml/2006/main" noChangeAspect="1"/>
+            </wp:cNvGraphicFramePr>
+            <a:graphic xmlns:a="http://schemas.openxmlformats.org/drawingml/2006/main">
+              <a:graphicData uri="http://schemas.openxmlformats.org/drawingml/2006/picture">
+                <pic:pic xmlns:pic="http://schemas.openxmlformats.org/drawingml/2006/picture">
+                  <pic:nvPicPr>
+                    <pic:cNvPr id="0" name="Picture 6"/>
+                    <pic:cNvPicPr>
+                      <a:picLocks noChangeAspect="1" noChangeArrowheads="1"/>
+                    </pic:cNvPicPr>
+                  </pic:nvPicPr>
+                  <pic:blipFill>
+                    <a:blip r:embed="rId5" cstate="print">
+                      <a:extLst>
+                        <a:ext uri="{28A0092B-C50C-407E-A947-70E740481C1C}">
+                          <a14:useLocalDpi xmlns:a14="http://schemas.microsoft.com/office/drawing/2010/main" val="0"/>
+                        </a:ext>
+                      </a:extLst>
+                    </a:blip>
+                    <a:srcRect/>
+                    <a:stretch>
+                      <a:fillRect/>
+                    </a:stretch>
+                  </pic:blipFill>
+                  <pic:spPr bwMode="auto">
+                    <a:xfrm>
+                      <a:off x="0" y="0"/>
+                      <a:ext cx="3208020" cy="5256530"/>
+                    </a:xfrm>
+                    <a:prstGeom prst="rect">
+                      <a:avLst/>
+                    </a:prstGeom>
+                    <a:noFill/>
+                    <a:ln>
+                      <a:noFill/>
+                    </a:ln>
+                  </pic:spPr>
+                </pic:pic>
+              </a:graphicData>
+            </a:graphic>
+            <wp14:sizeRelH relativeFrom="margin">
+              <wp14:pctWidth>0</wp14:pctWidth>
+            </wp14:sizeRelH>
+            <wp14:sizeRelV relativeFrom="margin">
+              <wp14:pctHeight>0</wp14:pctHeight>
+            </wp14:sizeRelV>
+          </wp:anchor>
+        </w:drawing>
+      </w:r>
+    </w:p>
+    <w:p>
+      <w:pPr>
+        <w:rPr>
+          <w:rFonts w:ascii="Times New Roman" w:hAnsi="Times New Roman" w:cs="Times New Roman"/>
+          <w:sz w:val="26"/>
+          <w:szCs w:val="26"/>
+        </w:rPr>
+      </w:pPr>
+    </w:p>
+    <w:p>
+      <w:pPr>
+        <w:rPr>
+          <w:rFonts w:ascii="Times New Roman" w:hAnsi="Times New Roman" w:cs="Times New Roman"/>
+          <w:sz w:val="26"/>
+          <w:szCs w:val="26"/>
+        </w:rPr>
+      </w:pPr>
+    </w:p>
+    <w:p>
+      <w:pPr>
+        <w:rPr>
+          <w:rFonts w:ascii="Times New Roman" w:hAnsi="Times New Roman" w:cs="Times New Roman"/>
+          <w:sz w:val="26"/>
+          <w:szCs w:val="26"/>
+        </w:rPr>
+      </w:pPr>
+    </w:p>
+    <w:p>
+      <w:pPr>
+        <w:rPr>
+          <w:rFonts w:ascii="Times New Roman" w:hAnsi="Times New Roman" w:cs="Times New Roman"/>
+          <w:sz w:val="26"/>
+          <w:szCs w:val="26"/>
+        </w:rPr>
+      </w:pPr>
+    </w:p>
+    <w:p>
+      <w:pPr>
+        <w:rPr>
+          <w:rFonts w:ascii="Times New Roman" w:hAnsi="Times New Roman" w:cs="Times New Roman"/>
+          <w:sz w:val="26"/>
+          <w:szCs w:val="26"/>
+        </w:rPr>
+      </w:pPr>
+    </w:p>
+    <w:p>
+      <w:pPr>
+        <w:rPr>
+          <w:rFonts w:ascii="Times New Roman" w:hAnsi="Times New Roman" w:cs="Times New Roman"/>
+          <w:sz w:val="26"/>
+          <w:szCs w:val="26"/>
+        </w:rPr>
+      </w:pPr>
+    </w:p>
+    <w:p>
+      <w:pPr>
+        <w:rPr>
+          <w:rFonts w:ascii="Times New Roman" w:hAnsi="Times New Roman" w:cs="Times New Roman"/>
+          <w:sz w:val="26"/>
+          <w:szCs w:val="26"/>
+        </w:rPr>
+      </w:pPr>
+    </w:p>
+    <w:p>
+      <w:pPr>
+        <w:rPr>
+          <w:rFonts w:ascii="Times New Roman" w:hAnsi="Times New Roman" w:cs="Times New Roman"/>
+          <w:sz w:val="26"/>
+          <w:szCs w:val="26"/>
+        </w:rPr>
+      </w:pPr>
+    </w:p>
+    <w:p>
+      <w:pPr>
+        <w:rPr>
+          <w:rFonts w:ascii="Times New Roman" w:hAnsi="Times New Roman" w:cs="Times New Roman"/>
+          <w:sz w:val="26"/>
+          <w:szCs w:val="26"/>
+        </w:rPr>
+      </w:pPr>
+    </w:p>
+    <w:p>
+      <w:pPr>
+        <w:rPr>
+          <w:rFonts w:ascii="Times New Roman" w:hAnsi="Times New Roman" w:cs="Times New Roman"/>
+          <w:sz w:val="26"/>
+          <w:szCs w:val="26"/>
+        </w:rPr>
+      </w:pPr>
+    </w:p>
+    <w:p>
+      <w:pPr>
+        <w:rPr>
+          <w:rFonts w:ascii="Times New Roman" w:hAnsi="Times New Roman" w:cs="Times New Roman"/>
+          <w:sz w:val="26"/>
+          <w:szCs w:val="26"/>
+        </w:rPr>
+      </w:pPr>
+    </w:p>
+    <w:p>
+      <w:pPr>
+        <w:rPr>
+          <w:rFonts w:ascii="Times New Roman" w:hAnsi="Times New Roman" w:cs="Times New Roman"/>
+          <w:sz w:val="26"/>
+          <w:szCs w:val="26"/>
+        </w:rPr>
+      </w:pPr>
+    </w:p>
+    <w:p>
+      <w:pPr>
+        <w:rPr>
+          <w:rFonts w:ascii="Times New Roman" w:hAnsi="Times New Roman" w:cs="Times New Roman"/>
+          <w:sz w:val="26"/>
+          <w:szCs w:val="26"/>
+        </w:rPr>
+      </w:pPr>
+    </w:p>
+    <w:p>
+      <w:pPr>
+        <w:rPr>
+          <w:rFonts w:ascii="Times New Roman" w:hAnsi="Times New Roman" w:cs="Times New Roman"/>
+          <w:sz w:val="26"/>
+          <w:szCs w:val="26"/>
+        </w:rPr>
+      </w:pPr>
+    </w:p>
+    <w:p>
+      <w:pPr>
+        <w:rPr>
+          <w:rFonts w:ascii="Times New Roman" w:hAnsi="Times New Roman" w:cs="Times New Roman"/>
+          <w:sz w:val="26"/>
+          <w:szCs w:val="26"/>
+        </w:rPr>
+      </w:pPr>
+    </w:p>
+    <w:p>
+      <w:pPr>
+        <w:rPr>
+          <w:rFonts w:ascii="Times New Roman" w:hAnsi="Times New Roman" w:cs="Times New Roman"/>
+          <w:sz w:val="26"/>
+          <w:szCs w:val="26"/>
+        </w:rPr>
+      </w:pPr>
+    </w:p>
+    <w:p>
+      <w:pPr>
+        <w:rPr>
+          <w:rFonts w:ascii="Times New Roman" w:hAnsi="Times New Roman" w:cs="Times New Roman"/>
+          <w:b/>
+          <w:bCs/>
+          <w:sz w:val="26"/>
+          <w:szCs w:val="26"/>
+        </w:rPr>
+      </w:pPr>
+      <w:r>
+        <w:rPr>
+          <w:rFonts w:ascii="Times New Roman" w:hAnsi="Times New Roman" w:cs="Times New Roman"/>
+          <w:b/>
+          <w:bCs/>
+          <w:sz w:val="26"/>
+          <w:szCs w:val="26"/>
+        </w:rPr>
+        <w:t>Technical Partitioning (Phân rã theo kỹ thuật)</w:t>
+      </w:r>
+    </w:p>
+    <w:p>
+      <w:pPr>
+        <w:rPr>
+          <w:rFonts w:ascii="Times New Roman" w:hAnsi="Times New Roman" w:cs="Times New Roman"/>
+          <w:sz w:val="26"/>
+          <w:szCs w:val="26"/>
+        </w:rPr>
+      </w:pPr>
+      <w:r>
+        <w:rPr>
+          <w:rFonts w:ascii="Times New Roman" w:hAnsi="Times New Roman" w:cs="Times New Roman"/>
+          <w:sz w:val="26"/>
+          <w:szCs w:val="26"/>
+        </w:rPr>
+        <w:lastRenderedPageBreak/>
+        <w:drawing>
+          <wp:anchor distT="0" distB="0" distL="114300" distR="114300" simplePos="0" relativeHeight="251659264" behindDoc="0" locked="0" layoutInCell="1" allowOverlap="1" wp14:anchorId="62A0B008" wp14:editId="36F062F8">
+            <wp:simplePos x="0" y="0"/>
+            <wp:positionH relativeFrom="column">
+              <wp:posOffset>0</wp:posOffset>
+            </wp:positionH>
+            <wp:positionV relativeFrom="paragraph">
+              <wp:posOffset>541020</wp:posOffset>
+            </wp:positionV>
+            <wp:extent cx="5918200" cy="3726180"/>
+            <wp:effectExtent l="0" t="0" r="6350" b="7620"/>
+            <wp:wrapSquare wrapText="bothSides"/>
+            <wp:docPr id="873382405" name="Picture 4"/>
+            <wp:cNvGraphicFramePr>
+              <a:graphicFrameLocks xmlns:a="http://schemas.openxmlformats.org/drawingml/2006/main" noChangeAspect="1"/>
+            </wp:cNvGraphicFramePr>
+            <a:graphic xmlns:a="http://schemas.openxmlformats.org/drawingml/2006/main">
+              <a:graphicData uri="http://schemas.openxmlformats.org/drawingml/2006/picture">
+                <pic:pic xmlns:pic="http://schemas.openxmlformats.org/drawingml/2006/picture">
+                  <pic:nvPicPr>
+                    <pic:cNvPr id="0" name="Picture 13"/>
+                    <pic:cNvPicPr>
+                      <a:picLocks noChangeAspect="1" noChangeArrowheads="1"/>
+                    </pic:cNvPicPr>
+                  </pic:nvPicPr>
+                  <pic:blipFill>
+                    <a:blip r:embed="rId6" cstate="print">
+                      <a:extLst>
+                        <a:ext uri="{28A0092B-C50C-407E-A947-70E740481C1C}">
+                          <a14:useLocalDpi xmlns:a14="http://schemas.microsoft.com/office/drawing/2010/main" val="0"/>
+                        </a:ext>
+                      </a:extLst>
+                    </a:blip>
+                    <a:srcRect/>
+                    <a:stretch>
+                      <a:fillRect/>
+                    </a:stretch>
+                  </pic:blipFill>
+                  <pic:spPr bwMode="auto">
+                    <a:xfrm>
+                      <a:off x="0" y="0"/>
+                      <a:ext cx="5918200" cy="3726180"/>
+                    </a:xfrm>
+                    <a:prstGeom prst="rect">
+                      <a:avLst/>
+                    </a:prstGeom>
+                    <a:noFill/>
+                    <a:ln>
+                      <a:noFill/>
+                    </a:ln>
+                  </pic:spPr>
+                </pic:pic>
+              </a:graphicData>
+            </a:graphic>
+            <wp14:sizeRelH relativeFrom="margin">
+              <wp14:pctWidth>0</wp14:pctWidth>
+            </wp14:sizeRelH>
+            <wp14:sizeRelV relativeFrom="margin">
+              <wp14:pctHeight>0</wp14:pctHeight>
+            </wp14:sizeRelV>
+          </wp:anchor>
+        </w:drawing>
+      </w:r>
+      <w:r>
+        <w:rPr>
+          <w:rFonts w:ascii="Times New Roman" w:hAnsi="Times New Roman" w:cs="Times New Roman"/>
+          <w:b/>
+          <w:bCs/>
+          <w:sz w:val="26"/>
+          <w:szCs w:val="26"/>
+        </w:rPr>
+        <w:t>Đặc điểm hình ảnh:</w:t>
+      </w:r>
+      <w:r>
+        <w:rPr>
+          <w:rFonts w:ascii="Times New Roman" w:hAnsi="Times New Roman" w:cs="Times New Roman"/>
+          <w:sz w:val="26"/>
+          <w:szCs w:val="26"/>
+        </w:rPr>
+        <w:t xml:space="preserve"> Các module xếp chồng lên nhau theo lớp (Layered Architecture). Nhìn vào chỉ thấy code, không thấy nghiệp vụ </w:t>
+      </w:r>
+    </w:p>
+    <w:p>
+      <w:pPr>
+        <w:rPr>
+          <w:rFonts w:ascii="Times New Roman" w:hAnsi="Times New Roman" w:cs="Times New Roman"/>
+          <w:sz w:val="26"/>
+          <w:szCs w:val="26"/>
+        </w:rPr>
+      </w:pPr>
     </w:p>
     <w:p>
       <w:pPr>

</xml_diff>